<commit_message>
Prepare audited v0.9.0 release candidate
Align version metadata, document partial reproducibility, repair diagnostic and RQ2 gate checks, and add manifest provenance and audit records.
</commit_message>
<xml_diff>
--- a/Acta_Astronautica_Manuscript.docx
+++ b/Acta_Astronautica_Manuscript.docx
@@ -2230,11 +2230,9 @@
         <w:rPr>
           <w:b/>
         </w:rPr>
-        <w:t>Data and code availability:</w:t>
+        <w:t>Data and code availability: The reproducibility package is being prepared as version 0.9.0 at https://github.com/kaganyurtk/sparse-trajectory-reconstruction; the repository remains private and no archival DOI has yet been issued. The package contains the main RQ1 training and evaluation implementation, selected diagnostic scripts, and RQ2 data-curation and split-preparation utilities. Code is licensed under MIT and author-written documentation under CC BY 4.0. Third-party telemetry is not covered by these licenses and is not redistributed. Processed trajectories, trained checkpoints, and the historical RQ2, NEXT-5 ablation, and Iridium-family training runners are not included. The package therefore does not currently support end-to-end reproduction of every reported analysis. Historical analysis fingerprints are distinguished from the path-normalized portable manifest in MANIFEST_PROVENANCE.json.</w:t>
       </w:r>
-      <w:r>
-        <w:t xml:space="preserve"> [Authors to insert final release locations, licenses/permissions, raw versus processed sharing scope, frozen code revision, run manifest and access conditions. A prior draft states FlightSketch redistribution permission is complete; verify the exact written authorization and attribution requirements before release.]</w:t>
-      </w:r>
+      <w:r/>
     </w:p>
     <w:p>
       <w:r>

</xml_diff>

<commit_message>
Recover original experiment records and complete manuscript declarations
</commit_message>
<xml_diff>
--- a/Acta_Astronautica_Manuscript.docx
+++ b/Acta_Astronautica_Manuscript.docx
@@ -13,31 +13,7 @@
     </w:p>
     <w:p>
       <w:r>
-        <w:rPr>
-          <w:b/>
-        </w:rPr>
-        <w:t>Target journal:</w:t>
-      </w:r>
-      <w:r>
-        <w:t xml:space="preserve"> Acta Astronautica · </w:t>
-      </w:r>
-      <w:r>
-        <w:rPr>
-          <w:b/>
-        </w:rPr>
-        <w:t>Article type:</w:t>
-      </w:r>
-      <w:r>
-        <w:t xml:space="preserve"> Original research · </w:t>
-      </w:r>
-      <w:r>
-        <w:rPr>
-          <w:b/>
-        </w:rPr>
-        <w:t>Status:</w:t>
-      </w:r>
-      <w:r>
-        <w:t xml:space="preserve"> Revised scientific draft with verified RQ1 and RQ2 results, integrated results figures and a verified bibliography; author-controlled declarations remain to be completed.</w:t>
+        <w:t>Target journal: Acta Astronautica · Article type: Original research</w:t>
       </w:r>
     </w:p>
     <w:p>
@@ -102,7 +78,7 @@
         <w:pStyle w:val="Heading1"/>
       </w:pPr>
       <w:r>
-        <w:t>Highlights — separate submission file after final wording check</w:t>
+        <w:t>Highlights</w:t>
       </w:r>
     </w:p>
     <w:p>
@@ -191,7 +167,7 @@
     </w:p>
     <w:p>
       <w:r>
-        <w:t>Forty flights contribute altitude and speed at 1 Hz from launch through 120 s (121 samples per flight). The fixed split has 28 training, six outer-validation and six held-out test flights. Training includes an inner fit/validation division of 22/6 flights. The outer-validation flights were visible during development and are not an independent final test. The six test flights were evaluated once with frozen models and no subsequent tuning. The measured speed is a magnitude, not an independently established vertical velocity. Record the specific extraction source, flight roster, units, preprocessing and sample provenance in the final supplement.</w:t>
+        <w:t>Forty flights contribute altitude and speed at 1 Hz from launch through 120 s (121 samples per flight). The fixed split has 28 training, six outer-validation and six held-out test flights. Training includes an inner fit/validation division of 22/6 flights. The outer-validation flights were visible during development and are not an independent final test. The six test flights were evaluated once with frozen models and no subsequent tuning. The measured speed is a magnitude, not an independently established vertical velocity. The flight roster, preprocessing and split details are provided in the Supplementary Information and recovered experiment records.</w:t>
       </w:r>
     </w:p>
     <w:p>
@@ -264,12 +240,12 @@
     </w:p>
     <w:p>
       <w:r>
-        <w:t>For RQ2, let h_i and v_i denote predicted altitude and recorded-channel velocity at adjacent 1 Hz grid points. Reconstruction v1.1 used the normalized finite-difference residual r_i = [(h_{i+1} − h_i)/Δt_i − (v_i + v_{i+1})/2]/σ_v, where σ_v is the fit-set velocity target standard deviation. The NN minimized the mean squared error over the two standardized outputs. KC-NN added 1.91 times the mean squared residual, using the frozen 5% physics weight from development.</w:t>
+        <w:t>For reconstruction v1.1, the NN and KC-NN were fitted on the FlightSketch fitting groups; Falcon 9 RQ1 checkpoint weights were not transferred. For RQ2, let h_i and v_i denote predicted altitude and recorded-channel velocity at adjacent 1 Hz grid points. Reconstruction v1.1 used the normalized finite-difference residual r_i = [(h_{i+1} − h_i)/Δt_i − (v_i + v_{i+1})/2]/σ_v, where σ_v is the fit-set velocity target standard deviation. The NN minimized the mean squared error over the two standardized outputs. KC-NN added 1.91 times the mean squared residual, using the frozen 5% physics weight from development.</w:t>
       </w:r>
     </w:p>
     <w:p>
       <w:r>
-        <w:t>Altitude and velocity errors are reported as RMSE in physical units. The combined standardized score is 0.5(RMSE_h/σ_h + RMSE_v/σ_v), using fit-set target standard deviations σ_h and σ_v. Compute KC-NN minus NN within each paired seed, so a positive difference means the constraint worsens the score. Report flight/group-level effects alongside averages. Seed variability measures training sensitivity, not independent flight-level uncertainty. For RQ1, report the existing flight bootstrap interval separately, with its resampling unit and computation rule. All claims of cross-group generalization refer to provisional metadata groups.</w:t>
+        <w:t>Altitude and velocity errors are reported as RMSE in physical units. The combined standardized score is 0.5(RMSE_h/σ_h + RMSE_v/σ_v), using fit-set target standard deviations σ_h and σ_v. Paired differences were computed as KC-NN minus NN, so a positive difference means the constraint worsens the score. Flight- and group-level effects are reported alongside averages. Seed variability measures training sensitivity, not independent flight-level uncertainty. For RQ1, the flight bootstrap interval is reported separately from optimization-seed variability. All claims of cross-group generalization refer to provisional metadata groups.</w:t>
       </w:r>
     </w:p>
     <w:p>
@@ -300,7 +276,7 @@
     </w:p>
     <w:p>
       <w:r>
-        <w:t>At 5% observations, NN versus KC-NN altitude RMSE was 2304.55 versus 1920.30 m, while speed RMSE was 46.77 versus 69.87 m/s. The kinematic-violation rate fell from 0.4262 to 0.0612. Yet the prespecified combined score difference (KC-NN minus NN) was +0.018634, with a constrained-model advantage on one of six held-out flights. The RQ1 closure audit reports a flight bootstrap 95% interval of −0.020757 to +0.045011. This interval includes zero; avoid presenting six flights as conclusive evidence of a population-wide effect.</w:t>
+        <w:t>At 5% observations, NN versus KC-NN altitude RMSE was 2304.55 versus 1920.30 m, while speed RMSE was 46.77 versus 69.87 m/s. The kinematic-violation rate fell from 0.4262 to 0.0612. Yet the prespecified combined score difference (KC-NN minus NN) was +0.018634, with a constrained-model advantage on one of six held-out flights. The RQ1 closure audit reports a flight bootstrap 95% interval of −0.020757 to +0.045011. This interval includes zero; the six-flight sample does not establish a population-wide effect.</w:t>
       </w:r>
     </w:p>
     <w:p>
@@ -2211,65 +2187,25 @@
         <w:pStyle w:val="Heading1"/>
       </w:pPr>
       <w:r>
-        <w:t>Submission material and author-controlled declarations</w:t>
+        <w:t>Declarations</w:t>
+      </w:r>
+    </w:p>
+    <w:p>
+      <w:r>
+        <w:t>Supplementary material: The Supplementary Information provides additional experimental specifications, sensitivity analyses, cohort descriptions and integrity records.</w:t>
       </w:r>
     </w:p>
     <w:p>
       <w:r>
         <w:rPr>
-          <w:b/>
+          <w:b w:val="0"/>
         </w:rPr>
-        <w:t>Figures and tables:</w:t>
-      </w:r>
-      <w:r>
-        <w:t xml:space="preserve"> The ten numbered results figures and three numbered results tables are integrated in this draft, including the explicitly labelled post-hoc NEXT-5 mechanism analysis and Iridium-family replication. Still to assemble for the supplement or appendix are the RQ2 development mask curve and the altitude-derivative versus recorded-velocity mismatch diagnostic.</w:t>
+        <w:t>Data and code availability: The version 0.9.0 reproducibility package is held at https://github.com/kaganyurtk/sparse-trajectory-reconstruction. The repository is currently private and an archival DOI has not yet been issued. The package includes RQ1 training and evaluation code, the recovered NEXT-5 ablation and Iridium-family runners, and the RQ2 reconstruction v1.1 runner, final split, manifests, saved checkpoints and historical verification records in Recovered_Experiment_Records_v0.9.0.zip. Third-party raw telemetry is not redistributed. Executing the historical workflows requires the permitted source data and configuration of historical input paths; a clean-environment end-to-end replay of the assembled package has not been completed. Code is licensed under MIT and author-written documentation under CC BY 4.0. Historical and path-normalized Iridium manifest fingerprints are distinguished in MANIFEST_PROVENANCE.json.</w:t>
       </w:r>
     </w:p>
     <w:p>
       <w:r>
-        <w:rPr>
-          <w:b/>
-        </w:rPr>
-        <w:t>Data and code availability: The reproducibility package is being prepared as version 0.9.0 at https://github.com/kaganyurtk/sparse-trajectory-reconstruction; the repository remains private and no archival DOI has yet been issued. The package contains the main RQ1 training and evaluation implementation, selected diagnostic scripts, and RQ2 data-curation and split-preparation utilities. Code is licensed under MIT and author-written documentation under CC BY 4.0. Third-party telemetry is not covered by these licenses and is not redistributed. Processed trajectories, trained checkpoints, and the historical RQ2, NEXT-5 ablation, and Iridium-family training runners are not included. The package therefore does not currently support end-to-end reproduction of every reported analysis. Historical analysis fingerprints are distinguished from the path-normalized portable manifest in MANIFEST_PROVENANCE.json.</w:t>
-      </w:r>
-      <w:r/>
-    </w:p>
-    <w:p>
-      <w:r>
-        <w:rPr>
-          <w:b/>
-        </w:rPr>
-        <w:t>Funding:</w:t>
-      </w:r>
-      <w:r>
-        <w:t xml:space="preserve"> This research received no external funding. </w:t>
-      </w:r>
-      <w:r>
-        <w:rPr>
-          <w:b/>
-        </w:rPr>
-        <w:t>Competing interests:</w:t>
-      </w:r>
-      <w:r>
-        <w:t xml:space="preserve"> The author declares no known competing financial interests or personal relationships that could have influenced the work. </w:t>
-      </w:r>
-      <w:r>
-        <w:rPr>
-          <w:b/>
-        </w:rPr>
-        <w:t>CRediT contributions:</w:t>
-      </w:r>
-      <w:r>
-        <w:t xml:space="preserve"> [Author to approve roles.] </w:t>
-      </w:r>
-      <w:r>
-        <w:rPr>
-          <w:b/>
-        </w:rPr>
-        <w:t>Ethics/permissions:</w:t>
-      </w:r>
-      <w:r>
-        <w:t xml:space="preserve"> [State only what the source permissions support.]</w:t>
+        <w:t>Funding: This research received no external funding. Competing interests: The author declares no known competing financial interests or personal relationships that could have influenced the work. CRediT author statement: Kağan Yurtkölesi: Conceptualization, Methodology, Software, Validation, Formal analysis, Investigation, Data curation, Writing – original draft, Writing – review &amp; editing, Visualization. Ethics and permissions: This study analyzed rocket-flight telemetry and did not involve human participants or animal experiments. Permission for the research use of FlightSketch data was obtained by the author. FlightSketch and the original flight-log contributors are acknowledged as the sources of those records. Third-party telemetry remains subject to its source terms and is not redistributed in the code package.</w:t>
       </w:r>
     </w:p>
     <w:p>

</xml_diff>